<commit_message>
Update use cases to match the draw.io revision and add USE CASE page
Rename the system to Massage Spa Salon CRM, add Manage Inventory and
Manage Customers, share Manage Sales Report between Admin and Manager,
drop the include relationships, and put the diagram under a USE CASE
heading in the rationale paper.

Co-Authored-By: Claude Opus 5.5 <noreply@anthropic.com>
Claude-Session: https://claude.ai/code/session_01QgvE9oWsttuXytVvCCjLqk
</commit_message>
<xml_diff>
--- a/docs/spa-salon-crm/Rationale_IT13_Spa_Salon_CRM.docx
+++ b/docs/spa-salon-crm/Rationale_IT13_Spa_Salon_CRM.docx
@@ -51,7 +51,7 @@
         <w:rPr>
           <w:b/>
         </w:rPr>
-        <w:t>Spa Salon Customer Relationship Management (CRM) System</w:t>
+        <w:t>Massage Spa Salon Customer Relationship Management (CRM) System</w:t>
       </w:r>
     </w:p>
     <w:p>
@@ -59,7 +59,7 @@
         <w:jc w:val="both"/>
       </w:pPr>
       <w:r>
-        <w:t>Spa salons often face challenges in handling customer inquiries, keeping track of customer records and service history, processing payments, supervising staff, and monitoring sales. Because many salons still rely on paper logbooks, chat messages, and spreadsheets, these problems can lead to lost customer information, slow and inaccurate billing, unorganized staff assignments, outdated service lists and prices, delayed sales reports, and regular customers who stop returning without the business noticing.</w:t>
+        <w:t>Massage spa salons often face challenges in handling customer inquiries, keeping track of customer records and service history, processing payments, supervising staff, tracking supplies, and monitoring sales. Because many salons still rely on paper logbooks, chat messages, and spreadsheets, these problems can lead to lost customer information, slow and inaccurate billing, unorganized staff assignments, outdated service lists and prices, untracked supplies such as massage oils and towels, delayed sales reports, and regular customers who stop returning without the business noticing.</w:t>
       </w:r>
     </w:p>
     <w:p>
@@ -67,7 +67,7 @@
         <w:jc w:val="both"/>
       </w:pPr>
       <w:r>
-        <w:t>To address these challenges, the proposed Spa Salon Customer Relationship Management (CRM) System, developed in C#, aims to integrate essential customer and business operations into one centralized platform. The system will have four user roles: Super Admin, Admin, Manager, and Staff. The Super Admin will manage admin accounts and salon subscriptions, the Admin will review sales reports, plan customer retention, manage staff, manage the business and its services, and oversee customer data collection, the Manager will also manage staff and the business and its services, prepare sales reports, and review customer feedback, while Staff will manage customer inquiries, entertain customers, and process payments. Customers will be served and recorded by the staff without needing to create accounts.</w:t>
+        <w:t>To address these challenges, the proposed Massage Spa Salon Customer Relationship Management (CRM) System, developed in C#, aims to integrate essential customer and business operations into one centralized platform. The system will have four user roles: Super Admin, Admin, Manager, and Staff. The Super Admin will manage admin accounts and salon subscriptions, the Admin will review sales reports, handle promotions and customer retention, oversee data collection, and manage staff, services, and sales reports, the Manager will manage staff, services, inventory, and sales reports and review customer feedback, while Staff will manage customer inquiries and customer records, process payments, and generate receipts. Customers will be served and recorded by the staff without needing to create accounts.</w:t>
       </w:r>
     </w:p>
     <w:p>
@@ -75,7 +75,7 @@
         <w:jc w:val="both"/>
       </w:pPr>
       <w:r>
-        <w:t>Through this integrated system, the salon can maintain complete customer records, speed up front-desk transactions, produce accurate sales reports, act on customer feedback, and identify customers who need retention offers. Ultimately, the proposed system aims to enhance operational efficiency, support better decision-making, strengthen customer loyalty, and provide clients with a more personalized and reliable salon experience.</w:t>
+        <w:t>Through this integrated system, the salon can maintain complete customer records, speed up front-desk transactions, produce accurate sales reports, act on customer feedback, keep track of inventory, and run promotions that encourage customers to return. Ultimately, the proposed system aims to enhance operational efficiency, support better decision-making, strengthen customer loyalty, and provide clients with a more personalized and reliable salon experience.</w:t>
       </w:r>
     </w:p>
     <w:p>
@@ -84,14 +84,28 @@
       </w:r>
     </w:p>
     <w:p>
+      <w:pPr>
+        <w:spacing w:after="240"/>
+      </w:pPr>
+      <w:r>
+        <w:rPr>
+          <w:b/>
+          <w:sz w:val="44"/>
+        </w:rPr>
+        <w:t>USE CASE</w:t>
+      </w:r>
+    </w:p>
+    <w:p>
+      <w:pPr>
+        <w:jc w:val="center"/>
+      </w:pPr>
       <w:r>
         <w:rPr>
           <w:noProof/>
         </w:rPr>
-        <w:lastRenderedPageBreak/>
         <w:drawing>
           <wp:inline distT="0" distB="0" distL="0" distR="0" wp14:anchorId="32CD86CC" wp14:editId="14F040BD">
-            <wp:extent cx="5851709" cy="7197602"/>
+            <wp:extent cx="5394960" cy="7067398"/>
             <wp:effectExtent l="0" t="0" r="0" b="0"/>
             <wp:docPr id="1" name="Picture 1"/>
             <wp:cNvGraphicFramePr>
@@ -113,7 +127,7 @@
                   <pic:spPr>
                     <a:xfrm>
                       <a:off x="0" y="0"/>
-                      <a:ext cx="5851709" cy="7197602"/>
+                      <a:ext cx="5394960" cy="7067398"/>
                     </a:xfrm>
                     <a:prstGeom prst="rect">
                       <a:avLst/>

</xml_diff>